<commit_message>
memoria V2: stand rectangular 2.5x5x2 m + presupuesto solo gasto corriente $20,000
</commit_message>
<xml_diff>
--- a/Arte Generativo y Morfogénesis Digital - Memoria CEROC Hangar V2.docx
+++ b/Arte Generativo y Morfogénesis Digital - Memoria CEROC Hangar V2.docx
@@ -364,7 +364,7 @@
         <w:rPr>
           <w:rtl w:val="0"/>
         </w:rPr>
-        <w:t xml:space="preserve">Para garantizar una experiencia envolvente en el escenario curvo/domo, el hardware se centra en la fidelidad visual y la baja latencia de red:</w:t>
+        <w:t>El proyecto se monta sobre el stand reglamentario del evento (2.5 m de altura × 5 m de ancho × 2 m de profundidad, con acceso frontal). El diseño se centra en crear una zona de inmersión controlada dentro de ese volumen fijo, priorizando el contraste y la legibilidad del patrón generativo:</w:t>
       </w:r>
     </w:p>
     <w:p>
@@ -389,13 +389,12 @@
           <w:bCs w:val="1"/>
           <w:rtl w:val="0"/>
         </w:rPr>
-        <w:t xml:space="preserve">Sistema de Proyección:</w:t>
-      </w:r>
-      <w:r>
-        <w:rPr>
-          <w:rtl w:val="0"/>
-        </w:rPr>
-        <w:t xml:space="preserve"> Uso de proyectores de tiro corto (Short Throw) para cubrir la superficie curva desde el centro, minimizando sombras y maximizando el contraste.</w:t>
+        <w:t>Superficie de Proyección Plana: Pared de fondo del stand cubierta con membrana textil tensada (Lycra Spandex blanca mate) que funciona como pantalla de retroproyección / proyección frontal según el acomodo del proyector aportado por el CEROC.</w:t>
+      </w:r>
+      <w:r>
+        <w:rPr>
+          <w:rtl w:val="0"/>
+        </w:rPr>
       </w:r>
     </w:p>
     <w:p>
@@ -420,13 +419,12 @@
           <w:bCs w:val="1"/>
           <w:rtl w:val="0"/>
         </w:rPr>
-        <w:t xml:space="preserve">Superficie Inmersiva:</w:t>
-      </w:r>
-      <w:r>
-        <w:rPr>
-          <w:rtl w:val="0"/>
-        </w:rPr>
-        <w:t xml:space="preserve"> Membrana textil técnica (Lycra Spandex de alta densidad) diseñada para una difusión uniforme de la luz.</w:t>
+        <w:t>Blackout Interior del Stand: Forrado en tela blackout negra mate de las paredes laterales y del techo visible, para reducir la luz ambiental y ganar contraste del patrón proyectado.</w:t>
+      </w:r>
+      <w:r>
+        <w:rPr>
+          <w:rtl w:val="0"/>
+        </w:rPr>
       </w:r>
     </w:p>
     <w:p>
@@ -451,13 +449,12 @@
           <w:bCs w:val="1"/>
           <w:rtl w:val="0"/>
         </w:rPr>
-        <w:t xml:space="preserve">Conectividad Wi-Fi 6:</w:t>
-      </w:r>
-      <w:r>
-        <w:rPr>
-          <w:rtl w:val="0"/>
-        </w:rPr>
-        <w:t xml:space="preserve"> Infraestructura de red dedicada para la transmisión de datos de pose y sincronización de video entre múltiples unidades de renderizado.</w:t>
+        <w:t>Cableado y Señalización: Extensiones HDMI/UTP de largo adecuado al stand, señalización de la zona de captura sobre el piso y mamparas gráficas impresas con el fundamento científico del proyecto.</w:t>
+      </w:r>
+      <w:r>
+        <w:rPr>
+          <w:rtl w:val="0"/>
+        </w:rPr>
       </w:r>
     </w:p>
     <w:p>
@@ -502,7 +499,7 @@
           <w:iCs w:val="1"/>
           <w:rtl w:val="0"/>
         </w:rPr>
-        <w:t xml:space="preserve">Nota: Este presupuesto excluye los costos de las cámaras OAK-D Lite y la unidad de procesamiento Raspberry Pi 5, los cuales son aportados como equipo base del CEROC.</w:t>
+        <w:t>Nota: Este presupuesto considera únicamente partidas de GASTO CORRIENTE (materiales, suministros e impresos). El equipo tecnológico — proyector de corto alcance, Raspberry Pi 5, cámara OAK-D, acelerador Hailo-8, laptop Windows de renderizado y router de red local — es aportado en su totalidad por el CEROC y por el responsable técnico como equipo propio, por lo que no forma parte del recurso solicitado.</w:t>
       </w:r>
     </w:p>
     <w:tbl>
@@ -711,104 +708,54 @@
             <w:vAlign w:val="top"/>
           </w:tcPr>
           <w:p>
-            <w:pPr>
-              <w:pBdr>
-                <w:top w:space="0" w:sz="0" w:val="nil"/>
-                <w:left w:space="0" w:sz="0" w:val="nil"/>
-                <w:bottom w:space="0" w:sz="0" w:val="nil"/>
-                <w:right w:space="0" w:sz="0" w:val="nil"/>
-                <w:between w:space="0" w:sz="0" w:val="nil"/>
-              </w:pBdr>
-              <w:shd w:fill="auto" w:val="clear"/>
-              <w:spacing w:after="120" w:before="120" w:line="300" w:lineRule="auto"/>
-              <w:rPr>
-                <w:b w:val="1"/>
-                <w:bCs w:val="1"/>
-              </w:rPr>
-            </w:pPr>
-            <w:r>
-              <w:rPr>
-                <w:b w:val="1"/>
-                <w:bCs w:val="1"/>
-                <w:rtl w:val="0"/>
-              </w:rPr>
-              <w:t xml:space="preserve">Sistema de Proyección Dual</w:t>
-            </w:r>
-          </w:p>
-        </w:tc>
-        <w:tc>
-          <w:tcPr>
-            <w:tcBorders>
-              <w:top w:color="dddddd" w:space="0" w:sz="6" w:val="single"/>
-              <w:left w:color="dddddd" w:space="0" w:sz="6" w:val="single"/>
-              <w:bottom w:color="dddddd" w:space="0" w:sz="6" w:val="single"/>
-              <w:right w:color="dddddd" w:space="0" w:sz="6" w:val="single"/>
-            </w:tcBorders>
-            <w:shd w:fill="auto" w:val="clear"/>
-            <w:tcMar>
-              <w:top w:w="120.0" w:type="dxa"/>
-              <w:left w:w="120.0" w:type="dxa"/>
-              <w:bottom w:w="120.0" w:type="dxa"/>
-              <w:right w:w="120.0" w:type="dxa"/>
-            </w:tcMar>
-            <w:vAlign w:val="top"/>
-          </w:tcPr>
-          <w:p>
-            <w:pPr>
-              <w:pBdr>
-                <w:top w:space="0" w:sz="0" w:val="nil"/>
-                <w:left w:space="0" w:sz="0" w:val="nil"/>
-                <w:bottom w:space="0" w:sz="0" w:val="nil"/>
-                <w:right w:space="0" w:sz="0" w:val="nil"/>
-                <w:between w:space="0" w:sz="0" w:val="nil"/>
-              </w:pBdr>
-              <w:shd w:fill="auto" w:val="clear"/>
-              <w:spacing w:after="120" w:before="120" w:line="300" w:lineRule="auto"/>
-              <w:rPr/>
-            </w:pPr>
-            <w:r>
-              <w:rPr>
-                <w:rtl w:val="0"/>
-              </w:rPr>
-              <w:t xml:space="preserve">2 Proyectores de alto brillo (3500+ lúmenes) con corrección trapezoidal avanzada para superficies curvas.</w:t>
-            </w:r>
-          </w:p>
-        </w:tc>
-        <w:tc>
-          <w:tcPr>
-            <w:tcBorders>
-              <w:top w:color="dddddd" w:space="0" w:sz="6" w:val="single"/>
-              <w:left w:color="dddddd" w:space="0" w:sz="6" w:val="single"/>
-              <w:bottom w:color="dddddd" w:space="0" w:sz="6" w:val="single"/>
-              <w:right w:color="dddddd" w:space="0" w:sz="6" w:val="single"/>
-            </w:tcBorders>
-            <w:shd w:fill="auto" w:val="clear"/>
-            <w:tcMar>
-              <w:top w:w="120.0" w:type="dxa"/>
-              <w:left w:w="120.0" w:type="dxa"/>
-              <w:bottom w:w="120.0" w:type="dxa"/>
-              <w:right w:w="120.0" w:type="dxa"/>
-            </w:tcMar>
-            <w:vAlign w:val="top"/>
-          </w:tcPr>
-          <w:p>
-            <w:pPr>
-              <w:pBdr>
-                <w:top w:space="0" w:sz="0" w:val="nil"/>
-                <w:left w:space="0" w:sz="0" w:val="nil"/>
-                <w:bottom w:space="0" w:sz="0" w:val="nil"/>
-                <w:right w:space="0" w:sz="0" w:val="nil"/>
-                <w:between w:space="0" w:sz="0" w:val="nil"/>
-              </w:pBdr>
-              <w:shd w:fill="auto" w:val="clear"/>
-              <w:spacing w:after="120" w:before="120" w:line="300" w:lineRule="auto"/>
-              <w:rPr/>
-            </w:pPr>
-            <w:r>
-              <w:rPr>
-                <w:rtl w:val="0"/>
-              </w:rPr>
-              <w:t xml:space="preserve">$11,500.00</w:t>
+            <w:r>
+              <w:t xml:space="preserve">Superficie de Proyección</w:t>
+            </w:r>
+          </w:p>
+        </w:tc>
+        <w:tc>
+          <w:tcPr>
+            <w:tcBorders>
+              <w:top w:color="dddddd" w:space="0" w:sz="6" w:val="single"/>
+              <w:left w:color="dddddd" w:space="0" w:sz="6" w:val="single"/>
+              <w:bottom w:color="dddddd" w:space="0" w:sz="6" w:val="single"/>
+              <w:right w:color="dddddd" w:space="0" w:sz="6" w:val="single"/>
+            </w:tcBorders>
+            <w:shd w:fill="auto" w:val="clear"/>
+            <w:tcMar>
+              <w:top w:w="120.0" w:type="dxa"/>
+              <w:left w:w="120.0" w:type="dxa"/>
+              <w:bottom w:w="120.0" w:type="dxa"/>
+              <w:right w:w="120.0" w:type="dxa"/>
+            </w:tcMar>
+            <w:vAlign w:val="top"/>
+          </w:tcPr>
+          <w:p>
+            <w:r>
+              <w:t xml:space="preserve">Lycra Spandex blanca mate 3 m × 2.5 m, repuesto idéntico ante deterioro, bastidor tubular ligero desarmable con tensores, ojillos y cordón elástico de tensado perimetral.</w:t>
+            </w:r>
+          </w:p>
+        </w:tc>
+        <w:tc>
+          <w:tcPr>
+            <w:tcBorders>
+              <w:top w:color="dddddd" w:space="0" w:sz="6" w:val="single"/>
+              <w:left w:color="dddddd" w:space="0" w:sz="6" w:val="single"/>
+              <w:bottom w:color="dddddd" w:space="0" w:sz="6" w:val="single"/>
+              <w:right w:color="dddddd" w:space="0" w:sz="6" w:val="single"/>
+            </w:tcBorders>
+            <w:shd w:fill="auto" w:val="clear"/>
+            <w:tcMar>
+              <w:top w:w="120.0" w:type="dxa"/>
+              <w:left w:w="120.0" w:type="dxa"/>
+              <w:bottom w:w="120.0" w:type="dxa"/>
+              <w:right w:w="120.0" w:type="dxa"/>
+            </w:tcMar>
+            <w:vAlign w:val="top"/>
+          </w:tcPr>
+          <w:p>
+            <w:r>
+              <w:t xml:space="preserve">$4,500.00</w:t>
             </w:r>
           </w:p>
         </w:tc>
@@ -836,104 +783,54 @@
             <w:vAlign w:val="top"/>
           </w:tcPr>
           <w:p>
-            <w:pPr>
-              <w:pBdr>
-                <w:top w:space="0" w:sz="0" w:val="nil"/>
-                <w:left w:space="0" w:sz="0" w:val="nil"/>
-                <w:bottom w:space="0" w:sz="0" w:val="nil"/>
-                <w:right w:space="0" w:sz="0" w:val="nil"/>
-                <w:between w:space="0" w:sz="0" w:val="nil"/>
-              </w:pBdr>
-              <w:shd w:fill="auto" w:val="clear"/>
-              <w:spacing w:after="120" w:before="120" w:line="300" w:lineRule="auto"/>
-              <w:rPr>
-                <w:b w:val="1"/>
-                <w:bCs w:val="1"/>
-              </w:rPr>
-            </w:pPr>
-            <w:r>
-              <w:rPr>
-                <w:b w:val="1"/>
-                <w:bCs w:val="1"/>
-                <w:rtl w:val="0"/>
-              </w:rPr>
-              <w:t xml:space="preserve">Estructura Geodésica</w:t>
-            </w:r>
-          </w:p>
-        </w:tc>
-        <w:tc>
-          <w:tcPr>
-            <w:tcBorders>
-              <w:top w:color="dddddd" w:space="0" w:sz="6" w:val="single"/>
-              <w:left w:color="dddddd" w:space="0" w:sz="6" w:val="single"/>
-              <w:bottom w:color="dddddd" w:space="0" w:sz="6" w:val="single"/>
-              <w:right w:color="dddddd" w:space="0" w:sz="6" w:val="single"/>
-            </w:tcBorders>
-            <w:shd w:fill="auto" w:val="clear"/>
-            <w:tcMar>
-              <w:top w:w="120.0" w:type="dxa"/>
-              <w:left w:w="120.0" w:type="dxa"/>
-              <w:bottom w:w="120.0" w:type="dxa"/>
-              <w:right w:w="120.0" w:type="dxa"/>
-            </w:tcMar>
-            <w:vAlign w:val="top"/>
-          </w:tcPr>
-          <w:p>
-            <w:pPr>
-              <w:pBdr>
-                <w:top w:space="0" w:sz="0" w:val="nil"/>
-                <w:left w:space="0" w:sz="0" w:val="nil"/>
-                <w:bottom w:space="0" w:sz="0" w:val="nil"/>
-                <w:right w:space="0" w:sz="0" w:val="nil"/>
-                <w:between w:space="0" w:sz="0" w:val="nil"/>
-              </w:pBdr>
-              <w:shd w:fill="auto" w:val="clear"/>
-              <w:spacing w:after="120" w:before="120" w:line="300" w:lineRule="auto"/>
-              <w:rPr/>
-            </w:pPr>
-            <w:r>
-              <w:rPr>
-                <w:rtl w:val="0"/>
-              </w:rPr>
-              <w:t xml:space="preserve">Tubería estructural de PVC reforzado, conectores industriales y herrajes de montaje rápido.</w:t>
-            </w:r>
-          </w:p>
-        </w:tc>
-        <w:tc>
-          <w:tcPr>
-            <w:tcBorders>
-              <w:top w:color="dddddd" w:space="0" w:sz="6" w:val="single"/>
-              <w:left w:color="dddddd" w:space="0" w:sz="6" w:val="single"/>
-              <w:bottom w:color="dddddd" w:space="0" w:sz="6" w:val="single"/>
-              <w:right w:color="dddddd" w:space="0" w:sz="6" w:val="single"/>
-            </w:tcBorders>
-            <w:shd w:fill="auto" w:val="clear"/>
-            <w:tcMar>
-              <w:top w:w="120.0" w:type="dxa"/>
-              <w:left w:w="120.0" w:type="dxa"/>
-              <w:bottom w:w="120.0" w:type="dxa"/>
-              <w:right w:w="120.0" w:type="dxa"/>
-            </w:tcMar>
-            <w:vAlign w:val="top"/>
-          </w:tcPr>
-          <w:p>
-            <w:pPr>
-              <w:pBdr>
-                <w:top w:space="0" w:sz="0" w:val="nil"/>
-                <w:left w:space="0" w:sz="0" w:val="nil"/>
-                <w:bottom w:space="0" w:sz="0" w:val="nil"/>
-                <w:right w:space="0" w:sz="0" w:val="nil"/>
-                <w:between w:space="0" w:sz="0" w:val="nil"/>
-              </w:pBdr>
-              <w:shd w:fill="auto" w:val="clear"/>
-              <w:spacing w:after="120" w:before="120" w:line="300" w:lineRule="auto"/>
-              <w:rPr/>
-            </w:pPr>
-            <w:r>
-              <w:rPr>
-                <w:rtl w:val="0"/>
-              </w:rPr>
-              <w:t xml:space="preserve">$3,500.00</w:t>
+            <w:r>
+              <w:t xml:space="preserve">Blackout Interior del Stand</w:t>
+            </w:r>
+          </w:p>
+        </w:tc>
+        <w:tc>
+          <w:tcPr>
+            <w:tcBorders>
+              <w:top w:color="dddddd" w:space="0" w:sz="6" w:val="single"/>
+              <w:left w:color="dddddd" w:space="0" w:sz="6" w:val="single"/>
+              <w:bottom w:color="dddddd" w:space="0" w:sz="6" w:val="single"/>
+              <w:right w:color="dddddd" w:space="0" w:sz="6" w:val="single"/>
+            </w:tcBorders>
+            <w:shd w:fill="auto" w:val="clear"/>
+            <w:tcMar>
+              <w:top w:w="120.0" w:type="dxa"/>
+              <w:left w:w="120.0" w:type="dxa"/>
+              <w:bottom w:w="120.0" w:type="dxa"/>
+              <w:right w:w="120.0" w:type="dxa"/>
+            </w:tcMar>
+            <w:vAlign w:val="top"/>
+          </w:tcPr>
+          <w:p>
+            <w:r>
+              <w:t xml:space="preserve">Tela blackout negra mate (≈30 m lineales) para forrar laterales y techo del stand a doble capa, manta antillama de respaldo, abrazaderas, cinta de fijación textil y velcro perimetral.</w:t>
+            </w:r>
+          </w:p>
+        </w:tc>
+        <w:tc>
+          <w:tcPr>
+            <w:tcBorders>
+              <w:top w:color="dddddd" w:space="0" w:sz="6" w:val="single"/>
+              <w:left w:color="dddddd" w:space="0" w:sz="6" w:val="single"/>
+              <w:bottom w:color="dddddd" w:space="0" w:sz="6" w:val="single"/>
+              <w:right w:color="dddddd" w:space="0" w:sz="6" w:val="single"/>
+            </w:tcBorders>
+            <w:shd w:fill="auto" w:val="clear"/>
+            <w:tcMar>
+              <w:top w:w="120.0" w:type="dxa"/>
+              <w:left w:w="120.0" w:type="dxa"/>
+              <w:bottom w:w="120.0" w:type="dxa"/>
+              <w:right w:w="120.0" w:type="dxa"/>
+            </w:tcMar>
+            <w:vAlign w:val="top"/>
+          </w:tcPr>
+          <w:p>
+            <w:r>
+              <w:t xml:space="preserve">$3,800.00</w:t>
             </w:r>
           </w:p>
         </w:tc>
@@ -961,104 +858,54 @@
             <w:vAlign w:val="top"/>
           </w:tcPr>
           <w:p>
-            <w:pPr>
-              <w:pBdr>
-                <w:top w:space="0" w:sz="0" w:val="nil"/>
-                <w:left w:space="0" w:sz="0" w:val="nil"/>
-                <w:bottom w:space="0" w:sz="0" w:val="nil"/>
-                <w:right w:space="0" w:sz="0" w:val="nil"/>
-                <w:between w:space="0" w:sz="0" w:val="nil"/>
-              </w:pBdr>
-              <w:shd w:fill="auto" w:val="clear"/>
-              <w:spacing w:after="120" w:before="120" w:line="300" w:lineRule="auto"/>
-              <w:rPr>
-                <w:b w:val="1"/>
-                <w:bCs w:val="1"/>
-              </w:rPr>
-            </w:pPr>
-            <w:r>
-              <w:rPr>
-                <w:b w:val="1"/>
-                <w:bCs w:val="1"/>
-                <w:rtl w:val="0"/>
-              </w:rPr>
-              <w:t xml:space="preserve">Membrana de Proyección</w:t>
-            </w:r>
-          </w:p>
-        </w:tc>
-        <w:tc>
-          <w:tcPr>
-            <w:tcBorders>
-              <w:top w:color="dddddd" w:space="0" w:sz="6" w:val="single"/>
-              <w:left w:color="dddddd" w:space="0" w:sz="6" w:val="single"/>
-              <w:bottom w:color="dddddd" w:space="0" w:sz="6" w:val="single"/>
-              <w:right w:color="dddddd" w:space="0" w:sz="6" w:val="single"/>
-            </w:tcBorders>
-            <w:shd w:fill="auto" w:val="clear"/>
-            <w:tcMar>
-              <w:top w:w="120.0" w:type="dxa"/>
-              <w:left w:w="120.0" w:type="dxa"/>
-              <w:bottom w:w="120.0" w:type="dxa"/>
-              <w:right w:w="120.0" w:type="dxa"/>
-            </w:tcMar>
-            <w:vAlign w:val="top"/>
-          </w:tcPr>
-          <w:p>
-            <w:pPr>
-              <w:pBdr>
-                <w:top w:space="0" w:sz="0" w:val="nil"/>
-                <w:left w:space="0" w:sz="0" w:val="nil"/>
-                <w:bottom w:space="0" w:sz="0" w:val="nil"/>
-                <w:right w:space="0" w:sz="0" w:val="nil"/>
-                <w:between w:space="0" w:sz="0" w:val="nil"/>
-              </w:pBdr>
-              <w:shd w:fill="auto" w:val="clear"/>
-              <w:spacing w:after="120" w:before="120" w:line="300" w:lineRule="auto"/>
-              <w:rPr/>
-            </w:pPr>
-            <w:r>
-              <w:rPr>
-                <w:rtl w:val="0"/>
-              </w:rPr>
-              <w:t xml:space="preserve">Lycra Spandex Blanca Mate (25m lineales) con tratamiento de difusión óptica.</w:t>
-            </w:r>
-          </w:p>
-        </w:tc>
-        <w:tc>
-          <w:tcPr>
-            <w:tcBorders>
-              <w:top w:color="dddddd" w:space="0" w:sz="6" w:val="single"/>
-              <w:left w:color="dddddd" w:space="0" w:sz="6" w:val="single"/>
-              <w:bottom w:color="dddddd" w:space="0" w:sz="6" w:val="single"/>
-              <w:right w:color="dddddd" w:space="0" w:sz="6" w:val="single"/>
-            </w:tcBorders>
-            <w:shd w:fill="auto" w:val="clear"/>
-            <w:tcMar>
-              <w:top w:w="120.0" w:type="dxa"/>
-              <w:left w:w="120.0" w:type="dxa"/>
-              <w:bottom w:w="120.0" w:type="dxa"/>
-              <w:right w:w="120.0" w:type="dxa"/>
-            </w:tcMar>
-            <w:vAlign w:val="top"/>
-          </w:tcPr>
-          <w:p>
-            <w:pPr>
-              <w:pBdr>
-                <w:top w:space="0" w:sz="0" w:val="nil"/>
-                <w:left w:space="0" w:sz="0" w:val="nil"/>
-                <w:bottom w:space="0" w:sz="0" w:val="nil"/>
-                <w:right w:space="0" w:sz="0" w:val="nil"/>
-                <w:between w:space="0" w:sz="0" w:val="nil"/>
-              </w:pBdr>
-              <w:shd w:fill="auto" w:val="clear"/>
-              <w:spacing w:after="120" w:before="120" w:line="300" w:lineRule="auto"/>
-              <w:rPr/>
-            </w:pPr>
-            <w:r>
-              <w:rPr>
-                <w:rtl w:val="0"/>
-              </w:rPr>
-              <w:t xml:space="preserve">$2,200.00</w:t>
+            <w:r>
+              <w:t xml:space="preserve">Mamparas y Gráficos Impresos</w:t>
+            </w:r>
+          </w:p>
+        </w:tc>
+        <w:tc>
+          <w:tcPr>
+            <w:tcBorders>
+              <w:top w:color="dddddd" w:space="0" w:sz="6" w:val="single"/>
+              <w:left w:color="dddddd" w:space="0" w:sz="6" w:val="single"/>
+              <w:bottom w:color="dddddd" w:space="0" w:sz="6" w:val="single"/>
+              <w:right w:color="dddddd" w:space="0" w:sz="6" w:val="single"/>
+            </w:tcBorders>
+            <w:shd w:fill="auto" w:val="clear"/>
+            <w:tcMar>
+              <w:top w:w="120.0" w:type="dxa"/>
+              <w:left w:w="120.0" w:type="dxa"/>
+              <w:bottom w:w="120.0" w:type="dxa"/>
+              <w:right w:w="120.0" w:type="dxa"/>
+            </w:tcMar>
+            <w:vAlign w:val="top"/>
+          </w:tcPr>
+          <w:p>
+            <w:r>
+              <w:t xml:space="preserve">Banner principal del proyecto (2.5 m × 1 m) en lona mate alta resolución; serie de 6 infografías del modelo Gray-Scott, esqueleto digital, BlazePose y reacción-difusión sobre coroplast 3 mm; cédulas de sala y créditos institucionales.</w:t>
+            </w:r>
+          </w:p>
+        </w:tc>
+        <w:tc>
+          <w:tcPr>
+            <w:tcBorders>
+              <w:top w:color="dddddd" w:space="0" w:sz="6" w:val="single"/>
+              <w:left w:color="dddddd" w:space="0" w:sz="6" w:val="single"/>
+              <w:bottom w:color="dddddd" w:space="0" w:sz="6" w:val="single"/>
+              <w:right w:color="dddddd" w:space="0" w:sz="6" w:val="single"/>
+            </w:tcBorders>
+            <w:shd w:fill="auto" w:val="clear"/>
+            <w:tcMar>
+              <w:top w:w="120.0" w:type="dxa"/>
+              <w:left w:w="120.0" w:type="dxa"/>
+              <w:bottom w:w="120.0" w:type="dxa"/>
+              <w:right w:w="120.0" w:type="dxa"/>
+            </w:tcMar>
+            <w:vAlign w:val="top"/>
+          </w:tcPr>
+          <w:p>
+            <w:r>
+              <w:t xml:space="preserve">$3,200.00</w:t>
             </w:r>
           </w:p>
         </w:tc>
@@ -1086,104 +933,54 @@
             <w:vAlign w:val="top"/>
           </w:tcPr>
           <w:p>
-            <w:pPr>
-              <w:pBdr>
-                <w:top w:space="0" w:sz="0" w:val="nil"/>
-                <w:left w:space="0" w:sz="0" w:val="nil"/>
-                <w:bottom w:space="0" w:sz="0" w:val="nil"/>
-                <w:right w:space="0" w:sz="0" w:val="nil"/>
-                <w:between w:space="0" w:sz="0" w:val="nil"/>
-              </w:pBdr>
-              <w:shd w:fill="auto" w:val="clear"/>
-              <w:spacing w:after="120" w:before="120" w:line="300" w:lineRule="auto"/>
-              <w:rPr>
-                <w:b w:val="1"/>
-                <w:bCs w:val="1"/>
-              </w:rPr>
-            </w:pPr>
-            <w:r>
-              <w:rPr>
-                <w:b w:val="1"/>
-                <w:bCs w:val="1"/>
-                <w:rtl w:val="0"/>
-              </w:rPr>
-              <w:t xml:space="preserve">Infraestructura de Red</w:t>
-            </w:r>
-          </w:p>
-        </w:tc>
-        <w:tc>
-          <w:tcPr>
-            <w:tcBorders>
-              <w:top w:color="dddddd" w:space="0" w:sz="6" w:val="single"/>
-              <w:left w:color="dddddd" w:space="0" w:sz="6" w:val="single"/>
-              <w:bottom w:color="dddddd" w:space="0" w:sz="6" w:val="single"/>
-              <w:right w:color="dddddd" w:space="0" w:sz="6" w:val="single"/>
-            </w:tcBorders>
-            <w:shd w:fill="auto" w:val="clear"/>
-            <w:tcMar>
-              <w:top w:w="120.0" w:type="dxa"/>
-              <w:left w:w="120.0" w:type="dxa"/>
-              <w:bottom w:w="120.0" w:type="dxa"/>
-              <w:right w:w="120.0" w:type="dxa"/>
-            </w:tcMar>
-            <w:vAlign w:val="top"/>
-          </w:tcPr>
-          <w:p>
-            <w:pPr>
-              <w:pBdr>
-                <w:top w:space="0" w:sz="0" w:val="nil"/>
-                <w:left w:space="0" w:sz="0" w:val="nil"/>
-                <w:bottom w:space="0" w:sz="0" w:val="nil"/>
-                <w:right w:space="0" w:sz="0" w:val="nil"/>
-                <w:between w:space="0" w:sz="0" w:val="nil"/>
-              </w:pBdr>
-              <w:shd w:fill="auto" w:val="clear"/>
-              <w:spacing w:after="120" w:before="120" w:line="300" w:lineRule="auto"/>
-              <w:rPr/>
-            </w:pPr>
-            <w:r>
-              <w:rPr>
-                <w:rtl w:val="0"/>
-              </w:rPr>
-              <w:t xml:space="preserve">Router Wi-Fi 6 (802.11ax) de alta velocidad para transmisión de datos OSC y NDI.</w:t>
-            </w:r>
-          </w:p>
-        </w:tc>
-        <w:tc>
-          <w:tcPr>
-            <w:tcBorders>
-              <w:top w:color="dddddd" w:space="0" w:sz="6" w:val="single"/>
-              <w:left w:color="dddddd" w:space="0" w:sz="6" w:val="single"/>
-              <w:bottom w:color="dddddd" w:space="0" w:sz="6" w:val="single"/>
-              <w:right w:color="dddddd" w:space="0" w:sz="6" w:val="single"/>
-            </w:tcBorders>
-            <w:shd w:fill="auto" w:val="clear"/>
-            <w:tcMar>
-              <w:top w:w="120.0" w:type="dxa"/>
-              <w:left w:w="120.0" w:type="dxa"/>
-              <w:bottom w:w="120.0" w:type="dxa"/>
-              <w:right w:w="120.0" w:type="dxa"/>
-            </w:tcMar>
-            <w:vAlign w:val="top"/>
-          </w:tcPr>
-          <w:p>
-            <w:pPr>
-              <w:pBdr>
-                <w:top w:space="0" w:sz="0" w:val="nil"/>
-                <w:left w:space="0" w:sz="0" w:val="nil"/>
-                <w:bottom w:space="0" w:sz="0" w:val="nil"/>
-                <w:right w:space="0" w:sz="0" w:val="nil"/>
-                <w:between w:space="0" w:sz="0" w:val="nil"/>
-              </w:pBdr>
-              <w:shd w:fill="auto" w:val="clear"/>
-              <w:spacing w:after="120" w:before="120" w:line="300" w:lineRule="auto"/>
-              <w:rPr/>
-            </w:pPr>
-            <w:r>
-              <w:rPr>
-                <w:rtl w:val="0"/>
-              </w:rPr>
-              <w:t xml:space="preserve">$1,800.00</w:t>
+            <w:r>
+              <w:t xml:space="preserve">Señalética de Zona Interactiva</w:t>
+            </w:r>
+          </w:p>
+        </w:tc>
+        <w:tc>
+          <w:tcPr>
+            <w:tcBorders>
+              <w:top w:color="dddddd" w:space="0" w:sz="6" w:val="single"/>
+              <w:left w:color="dddddd" w:space="0" w:sz="6" w:val="single"/>
+              <w:bottom w:color="dddddd" w:space="0" w:sz="6" w:val="single"/>
+              <w:right w:color="dddddd" w:space="0" w:sz="6" w:val="single"/>
+            </w:tcBorders>
+            <w:shd w:fill="auto" w:val="clear"/>
+            <w:tcMar>
+              <w:top w:w="120.0" w:type="dxa"/>
+              <w:left w:w="120.0" w:type="dxa"/>
+              <w:bottom w:w="120.0" w:type="dxa"/>
+              <w:right w:w="120.0" w:type="dxa"/>
+            </w:tcMar>
+            <w:vAlign w:val="top"/>
+          </w:tcPr>
+          <w:p>
+            <w:r>
+              <w:t xml:space="preserve">Vinil mate antideslizante de gran formato para marcar la zona de captura sobre el piso, cinta delimitadora reflejante y stickers de flujo del público con pictogramas de seguridad.</w:t>
+            </w:r>
+          </w:p>
+        </w:tc>
+        <w:tc>
+          <w:tcPr>
+            <w:tcBorders>
+              <w:top w:color="dddddd" w:space="0" w:sz="6" w:val="single"/>
+              <w:left w:color="dddddd" w:space="0" w:sz="6" w:val="single"/>
+              <w:bottom w:color="dddddd" w:space="0" w:sz="6" w:val="single"/>
+              <w:right w:color="dddddd" w:space="0" w:sz="6" w:val="single"/>
+            </w:tcBorders>
+            <w:shd w:fill="auto" w:val="clear"/>
+            <w:tcMar>
+              <w:top w:w="120.0" w:type="dxa"/>
+              <w:left w:w="120.0" w:type="dxa"/>
+              <w:bottom w:w="120.0" w:type="dxa"/>
+              <w:right w:w="120.0" w:type="dxa"/>
+            </w:tcMar>
+            <w:vAlign w:val="top"/>
+          </w:tcPr>
+          <w:p>
+            <w:r>
+              <w:t xml:space="preserve">$1,000.00</w:t>
             </w:r>
           </w:p>
         </w:tc>
@@ -1211,130 +1008,54 @@
             <w:vAlign w:val="top"/>
           </w:tcPr>
           <w:p>
-            <w:pPr>
-              <w:pBdr>
-                <w:top w:space="0" w:sz="0" w:val="nil"/>
-                <w:left w:space="0" w:sz="0" w:val="nil"/>
-                <w:bottom w:space="0" w:sz="0" w:val="nil"/>
-                <w:right w:space="0" w:sz="0" w:val="nil"/>
-                <w:between w:space="0" w:sz="0" w:val="nil"/>
-              </w:pBdr>
-              <w:shd w:fill="auto" w:val="clear"/>
-              <w:spacing w:after="120" w:before="120" w:line="300" w:lineRule="auto"/>
-              <w:rPr>
-                <w:b w:val="1"/>
-                <w:bCs w:val="1"/>
-              </w:rPr>
-            </w:pPr>
-            <w:r>
-              <w:rPr>
-                <w:b w:val="1"/>
-                <w:bCs w:val="1"/>
-                <w:rtl w:val="0"/>
-              </w:rPr>
-              <w:t xml:space="preserve">Materiales de Consumo</w:t>
-            </w:r>
-          </w:p>
-        </w:tc>
-        <w:tc>
-          <w:tcPr>
-            <w:tcBorders>
-              <w:top w:color="dddddd" w:space="0" w:sz="6" w:val="single"/>
-              <w:left w:color="dddddd" w:space="0" w:sz="6" w:val="single"/>
-              <w:bottom w:color="dddddd" w:space="0" w:sz="6" w:val="single"/>
-              <w:right w:color="dddddd" w:space="0" w:sz="6" w:val="single"/>
-            </w:tcBorders>
-            <w:shd w:fill="auto" w:val="clear"/>
-            <w:tcMar>
-              <w:top w:w="120.0" w:type="dxa"/>
-              <w:left w:w="120.0" w:type="dxa"/>
-              <w:bottom w:w="120.0" w:type="dxa"/>
-              <w:right w:w="120.0" w:type="dxa"/>
-            </w:tcMar>
-            <w:vAlign w:val="top"/>
-          </w:tcPr>
-          <w:p>
-            <w:pPr>
-              <w:pBdr>
-                <w:top w:space="0" w:sz="0" w:val="nil"/>
-                <w:left w:space="0" w:sz="0" w:val="nil"/>
-                <w:bottom w:space="0" w:sz="0" w:val="nil"/>
-                <w:right w:space="0" w:sz="0" w:val="nil"/>
-                <w:between w:space="0" w:sz="0" w:val="nil"/>
-              </w:pBdr>
-              <w:shd w:fill="auto" w:val="clear"/>
-              <w:spacing w:after="120" w:before="120" w:line="300" w:lineRule="auto"/>
-              <w:rPr/>
-            </w:pPr>
-            <w:r>
-              <w:rPr>
-                <w:rtl w:val="0"/>
-              </w:rPr>
-              <w:t xml:space="preserve">Cables HDMI 2.1, adaptadores, filamento PETG para piezas custom y soportes.</w:t>
-            </w:r>
-          </w:p>
-        </w:tc>
-        <w:tc>
-          <w:tcPr>
-            <w:tcBorders>
-              <w:top w:color="dddddd" w:space="0" w:sz="6" w:val="single"/>
-              <w:left w:color="dddddd" w:space="0" w:sz="6" w:val="single"/>
-              <w:bottom w:color="dddddd" w:space="0" w:sz="6" w:val="single"/>
-              <w:right w:color="dddddd" w:space="0" w:sz="6" w:val="single"/>
-            </w:tcBorders>
-            <w:shd w:fill="auto" w:val="clear"/>
-            <w:tcMar>
-              <w:top w:w="120.0" w:type="dxa"/>
-              <w:left w:w="120.0" w:type="dxa"/>
-              <w:bottom w:w="120.0" w:type="dxa"/>
-              <w:right w:w="120.0" w:type="dxa"/>
-            </w:tcMar>
-            <w:vAlign w:val="top"/>
-          </w:tcPr>
-          <w:p>
-            <w:pPr>
-              <w:pBdr>
-                <w:top w:space="0" w:sz="0" w:val="nil"/>
-                <w:left w:space="0" w:sz="0" w:val="nil"/>
-                <w:bottom w:space="0" w:sz="0" w:val="nil"/>
-                <w:right w:space="0" w:sz="0" w:val="nil"/>
-                <w:between w:space="0" w:sz="0" w:val="nil"/>
-              </w:pBdr>
-              <w:shd w:fill="auto" w:val="clear"/>
-              <w:spacing w:after="120" w:before="120" w:line="300" w:lineRule="auto"/>
-              <w:rPr/>
-            </w:pPr>
-            <w:r>
-              <w:rPr>
-                <w:rtl w:val="0"/>
-              </w:rPr>
-              <w:t xml:space="preserve">$1,000.00</w:t>
-            </w:r>
-          </w:p>
-          <w:p>
-            <w:pPr>
-              <w:keepNext w:val="0"/>
-              <w:keepLines w:val="0"/>
-              <w:pageBreakBefore w:val="0"/>
-              <w:widowControl w:val="0"/>
-              <w:pBdr>
-                <w:top w:space="0" w:sz="0" w:val="nil"/>
-                <w:left w:space="0" w:sz="0" w:val="nil"/>
-                <w:bottom w:space="0" w:sz="0" w:val="nil"/>
-                <w:right w:space="0" w:sz="0" w:val="nil"/>
-                <w:between w:space="0" w:sz="0" w:val="nil"/>
-              </w:pBdr>
-              <w:shd w:fill="auto" w:val="clear"/>
-              <w:spacing w:after="0" w:before="0" w:line="240" w:lineRule="auto"/>
-              <w:ind w:left="0" w:right="0" w:firstLine="0"/>
-              <w:jc w:val="left"/>
-              <w:rPr/>
-            </w:pPr>
-            <w:r>
-              <w:rPr>
-                <w:rtl w:val="0"/>
-              </w:rPr>
-              <w:t xml:space="preserve"> </w:t>
+            <w:r>
+              <w:t xml:space="preserve">Iluminación Ambiental de Apoyo</w:t>
+            </w:r>
+          </w:p>
+        </w:tc>
+        <w:tc>
+          <w:tcPr>
+            <w:tcBorders>
+              <w:top w:color="dddddd" w:space="0" w:sz="6" w:val="single"/>
+              <w:left w:color="dddddd" w:space="0" w:sz="6" w:val="single"/>
+              <w:bottom w:color="dddddd" w:space="0" w:sz="6" w:val="single"/>
+              <w:right w:color="dddddd" w:space="0" w:sz="6" w:val="single"/>
+            </w:tcBorders>
+            <w:shd w:fill="auto" w:val="clear"/>
+            <w:tcMar>
+              <w:top w:w="120.0" w:type="dxa"/>
+              <w:left w:w="120.0" w:type="dxa"/>
+              <w:bottom w:w="120.0" w:type="dxa"/>
+              <w:right w:w="120.0" w:type="dxa"/>
+            </w:tcMar>
+            <w:vAlign w:val="top"/>
+          </w:tcPr>
+          <w:p>
+            <w:r>
+              <w:t xml:space="preserve">Tira LED RGB direccionable con fuente regulada, controlador consumible y kit de repuestos; luminaria LED de relleno de luz cálida y luminaria UV-A baja para realce escenográfico.</w:t>
+            </w:r>
+          </w:p>
+        </w:tc>
+        <w:tc>
+          <w:tcPr>
+            <w:tcBorders>
+              <w:top w:color="dddddd" w:space="0" w:sz="6" w:val="single"/>
+              <w:left w:color="dddddd" w:space="0" w:sz="6" w:val="single"/>
+              <w:bottom w:color="dddddd" w:space="0" w:sz="6" w:val="single"/>
+              <w:right w:color="dddddd" w:space="0" w:sz="6" w:val="single"/>
+            </w:tcBorders>
+            <w:shd w:fill="auto" w:val="clear"/>
+            <w:tcMar>
+              <w:top w:w="120.0" w:type="dxa"/>
+              <w:left w:w="120.0" w:type="dxa"/>
+              <w:bottom w:w="120.0" w:type="dxa"/>
+              <w:right w:w="120.0" w:type="dxa"/>
+            </w:tcMar>
+            <w:vAlign w:val="top"/>
+          </w:tcPr>
+          <w:p>
+            <w:r>
+              <w:t xml:space="preserve">$1,800.00</w:t>
             </w:r>
           </w:p>
         </w:tc>
@@ -1346,91 +1067,452 @@
         </w:trPr>
         <w:tc>
           <w:tcPr>
-            <w:gridSpan w:val="2"/>
-            <w:tcBorders>
-              <w:top w:color="dddddd" w:space="0" w:sz="6" w:val="single"/>
-              <w:left w:color="dddddd" w:space="0" w:sz="6" w:val="single"/>
-              <w:bottom w:color="dddddd" w:space="0" w:sz="6" w:val="single"/>
-              <w:right w:color="dddddd" w:space="0" w:sz="6" w:val="single"/>
-            </w:tcBorders>
-            <w:shd w:fill="f9f9f9" w:val="clear"/>
-            <w:tcMar>
-              <w:top w:w="120.0" w:type="dxa"/>
-              <w:left w:w="120.0" w:type="dxa"/>
-              <w:bottom w:w="120.0" w:type="dxa"/>
-              <w:right w:w="120.0" w:type="dxa"/>
-            </w:tcMar>
-            <w:vAlign w:val="top"/>
-          </w:tcPr>
-          <w:p>
-            <w:pPr>
-              <w:pBdr>
-                <w:top w:space="0" w:sz="0" w:val="nil"/>
-                <w:left w:space="0" w:sz="0" w:val="nil"/>
-                <w:bottom w:space="0" w:sz="0" w:val="nil"/>
-                <w:right w:space="0" w:sz="0" w:val="nil"/>
-                <w:between w:space="0" w:sz="0" w:val="nil"/>
-              </w:pBdr>
-              <w:shd w:fill="auto" w:val="clear"/>
-              <w:spacing w:after="120" w:before="120" w:line="300" w:lineRule="auto"/>
-              <w:jc w:val="right"/>
+            <w:tcBorders>
+              <w:top w:color="dddddd" w:space="0" w:sz="6" w:val="single"/>
+              <w:left w:color="dddddd" w:space="0" w:sz="6" w:val="single"/>
+              <w:bottom w:color="dddddd" w:space="0" w:sz="6" w:val="single"/>
+              <w:right w:color="dddddd" w:space="0" w:sz="6" w:val="single"/>
+            </w:tcBorders>
+            <w:shd w:fill="auto" w:val="clear"/>
+            <w:tcMar>
+              <w:top w:w="120.0" w:type="dxa"/>
+              <w:left w:w="120.0" w:type="dxa"/>
+              <w:bottom w:w="120.0" w:type="dxa"/>
+              <w:right w:w="120.0" w:type="dxa"/>
+            </w:tcMar>
+            <w:vAlign w:val="top"/>
+          </w:tcPr>
+          <w:p>
+            <w:r>
+              <w:t xml:space="preserve">Cableado y Consumibles de Conectividad</w:t>
+            </w:r>
+          </w:p>
+        </w:tc>
+        <w:tc>
+          <w:tcPr>
+            <w:tcBorders>
+              <w:top w:color="dddddd" w:space="0" w:sz="6" w:val="single"/>
+              <w:left w:color="dddddd" w:space="0" w:sz="6" w:val="single"/>
+              <w:bottom w:color="dddddd" w:space="0" w:sz="6" w:val="single"/>
+              <w:right w:color="dddddd" w:space="0" w:sz="6" w:val="single"/>
+            </w:tcBorders>
+            <w:shd w:fill="auto" w:val="clear"/>
+            <w:tcMar>
+              <w:top w:w="120.0" w:type="dxa"/>
+              <w:left w:w="120.0" w:type="dxa"/>
+              <w:bottom w:w="120.0" w:type="dxa"/>
+              <w:right w:w="120.0" w:type="dxa"/>
+            </w:tcMar>
+            <w:vAlign w:val="top"/>
+          </w:tcPr>
+          <w:p>
+            <w:r>
+              <w:t xml:space="preserve">Cables HDMI 5 m, 10 m y 15 m con repuesto, extensiones eléctricas 3 m y 5 m, barras multicontacto con supresor, cable de red Cat 6 10 m y 20 m, adaptadores DisplayPort/USB-C, conectores HDMI hembra-hembra y rollo de cinta canalizadora.</w:t>
+            </w:r>
+          </w:p>
+        </w:tc>
+        <w:tc>
+          <w:tcPr>
+            <w:tcBorders>
+              <w:top w:color="dddddd" w:space="0" w:sz="6" w:val="single"/>
+              <w:left w:color="dddddd" w:space="0" w:sz="6" w:val="single"/>
+              <w:bottom w:color="dddddd" w:space="0" w:sz="6" w:val="single"/>
+              <w:right w:color="dddddd" w:space="0" w:sz="6" w:val="single"/>
+            </w:tcBorders>
+            <w:shd w:fill="auto" w:val="clear"/>
+            <w:tcMar>
+              <w:top w:w="120.0" w:type="dxa"/>
+              <w:left w:w="120.0" w:type="dxa"/>
+              <w:bottom w:w="120.0" w:type="dxa"/>
+              <w:right w:w="120.0" w:type="dxa"/>
+            </w:tcMar>
+            <w:vAlign w:val="top"/>
+          </w:tcPr>
+          <w:p>
+            <w:r>
+              <w:t xml:space="preserve">$2,200.00</w:t>
+            </w:r>
+          </w:p>
+        </w:tc>
+      </w:tr>
+      <w:tr>
+        <w:trPr>
+          <w:cantSplit w:val="0"/>
+          <w:tblHeader w:val="0"/>
+        </w:trPr>
+        <w:tc>
+          <w:tcPr>
+            <w:tcBorders>
+              <w:top w:color="dddddd" w:space="0" w:sz="6" w:val="single"/>
+              <w:left w:color="dddddd" w:space="0" w:sz="6" w:val="single"/>
+              <w:bottom w:color="dddddd" w:space="0" w:sz="6" w:val="single"/>
+              <w:right w:color="dddddd" w:space="0" w:sz="6" w:val="single"/>
+            </w:tcBorders>
+            <w:shd w:fill="auto" w:val="clear"/>
+            <w:tcMar>
+              <w:top w:w="120.0" w:type="dxa"/>
+              <w:left w:w="120.0" w:type="dxa"/>
+              <w:bottom w:w="120.0" w:type="dxa"/>
+              <w:right w:w="120.0" w:type="dxa"/>
+            </w:tcMar>
+            <w:vAlign w:val="top"/>
+          </w:tcPr>
+          <w:p>
+            <w:r>
+              <w:t xml:space="preserve">Material de Montaje y Fijación</w:t>
+            </w:r>
+          </w:p>
+        </w:tc>
+        <w:tc>
+          <w:tcPr>
+            <w:tcBorders>
+              <w:top w:color="dddddd" w:space="0" w:sz="6" w:val="single"/>
+              <w:left w:color="dddddd" w:space="0" w:sz="6" w:val="single"/>
+              <w:bottom w:color="dddddd" w:space="0" w:sz="6" w:val="single"/>
+              <w:right w:color="dddddd" w:space="0" w:sz="6" w:val="single"/>
+            </w:tcBorders>
+            <w:shd w:fill="auto" w:val="clear"/>
+            <w:tcMar>
+              <w:top w:w="120.0" w:type="dxa"/>
+              <w:left w:w="120.0" w:type="dxa"/>
+              <w:bottom w:w="120.0" w:type="dxa"/>
+              <w:right w:w="120.0" w:type="dxa"/>
+            </w:tcMar>
+            <w:vAlign w:val="top"/>
+          </w:tcPr>
+          <w:p>
+            <w:r>
+              <w:t xml:space="preserve">Cinchos plásticos de varios calibres, velcro industrial, cinta doble cara de montaje pesado, tornillería, mosquetones, ganchos tipo 'S' y cordel de polipropileno.</w:t>
+            </w:r>
+          </w:p>
+        </w:tc>
+        <w:tc>
+          <w:tcPr>
+            <w:tcBorders>
+              <w:top w:color="dddddd" w:space="0" w:sz="6" w:val="single"/>
+              <w:left w:color="dddddd" w:space="0" w:sz="6" w:val="single"/>
+              <w:bottom w:color="dddddd" w:space="0" w:sz="6" w:val="single"/>
+              <w:right w:color="dddddd" w:space="0" w:sz="6" w:val="single"/>
+            </w:tcBorders>
+            <w:shd w:fill="auto" w:val="clear"/>
+            <w:tcMar>
+              <w:top w:w="120.0" w:type="dxa"/>
+              <w:left w:w="120.0" w:type="dxa"/>
+              <w:bottom w:w="120.0" w:type="dxa"/>
+              <w:right w:w="120.0" w:type="dxa"/>
+            </w:tcMar>
+            <w:vAlign w:val="top"/>
+          </w:tcPr>
+          <w:p>
+            <w:r>
+              <w:t xml:space="preserve">$900.00</w:t>
+            </w:r>
+          </w:p>
+        </w:tc>
+      </w:tr>
+      <w:tr>
+        <w:trPr>
+          <w:cantSplit w:val="0"/>
+          <w:tblHeader w:val="0"/>
+        </w:trPr>
+        <w:tc>
+          <w:tcPr>
+            <w:tcBorders>
+              <w:top w:color="dddddd" w:space="0" w:sz="6" w:val="single"/>
+              <w:left w:color="dddddd" w:space="0" w:sz="6" w:val="single"/>
+              <w:bottom w:color="dddddd" w:space="0" w:sz="6" w:val="single"/>
+              <w:right w:color="dddddd" w:space="0" w:sz="6" w:val="single"/>
+            </w:tcBorders>
+            <w:shd w:fill="auto" w:val="clear"/>
+            <w:tcMar>
+              <w:top w:w="120.0" w:type="dxa"/>
+              <w:left w:w="120.0" w:type="dxa"/>
+              <w:bottom w:w="120.0" w:type="dxa"/>
+              <w:right w:w="120.0" w:type="dxa"/>
+            </w:tcMar>
+            <w:vAlign w:val="top"/>
+          </w:tcPr>
+          <w:p>
+            <w:r>
+              <w:t xml:space="preserve">Pintura y Acabados</w:t>
+            </w:r>
+          </w:p>
+        </w:tc>
+        <w:tc>
+          <w:tcPr>
+            <w:tcBorders>
+              <w:top w:color="dddddd" w:space="0" w:sz="6" w:val="single"/>
+              <w:left w:color="dddddd" w:space="0" w:sz="6" w:val="single"/>
+              <w:bottom w:color="dddddd" w:space="0" w:sz="6" w:val="single"/>
+              <w:right w:color="dddddd" w:space="0" w:sz="6" w:val="single"/>
+            </w:tcBorders>
+            <w:shd w:fill="auto" w:val="clear"/>
+            <w:tcMar>
+              <w:top w:w="120.0" w:type="dxa"/>
+              <w:left w:w="120.0" w:type="dxa"/>
+              <w:bottom w:w="120.0" w:type="dxa"/>
+              <w:right w:w="120.0" w:type="dxa"/>
+            </w:tcMar>
+            <w:vAlign w:val="top"/>
+          </w:tcPr>
+          <w:p>
+            <w:r>
+              <w:t xml:space="preserve">Pintura acrílica negro mate para panel de ocultamiento de equipo, esmalte de retoque, brochas, rodillos, charolas y cinta de enmascarar de baja adherencia.</w:t>
+            </w:r>
+          </w:p>
+        </w:tc>
+        <w:tc>
+          <w:tcPr>
+            <w:tcBorders>
+              <w:top w:color="dddddd" w:space="0" w:sz="6" w:val="single"/>
+              <w:left w:color="dddddd" w:space="0" w:sz="6" w:val="single"/>
+              <w:bottom w:color="dddddd" w:space="0" w:sz="6" w:val="single"/>
+              <w:right w:color="dddddd" w:space="0" w:sz="6" w:val="single"/>
+            </w:tcBorders>
+            <w:shd w:fill="auto" w:val="clear"/>
+            <w:tcMar>
+              <w:top w:w="120.0" w:type="dxa"/>
+              <w:left w:w="120.0" w:type="dxa"/>
+              <w:bottom w:w="120.0" w:type="dxa"/>
+              <w:right w:w="120.0" w:type="dxa"/>
+            </w:tcMar>
+            <w:vAlign w:val="top"/>
+          </w:tcPr>
+          <w:p>
+            <w:r>
+              <w:t xml:space="preserve">$700.00</w:t>
+            </w:r>
+          </w:p>
+        </w:tc>
+      </w:tr>
+      <w:tr>
+        <w:trPr>
+          <w:cantSplit w:val="0"/>
+          <w:tblHeader w:val="0"/>
+        </w:trPr>
+        <w:tc>
+          <w:tcPr>
+            <w:tcBorders>
+              <w:top w:color="dddddd" w:space="0" w:sz="6" w:val="single"/>
+              <w:left w:color="dddddd" w:space="0" w:sz="6" w:val="single"/>
+              <w:bottom w:color="dddddd" w:space="0" w:sz="6" w:val="single"/>
+              <w:right w:color="dddddd" w:space="0" w:sz="6" w:val="single"/>
+            </w:tcBorders>
+            <w:shd w:fill="auto" w:val="clear"/>
+            <w:tcMar>
+              <w:top w:w="120.0" w:type="dxa"/>
+              <w:left w:w="120.0" w:type="dxa"/>
+              <w:bottom w:w="120.0" w:type="dxa"/>
+              <w:right w:w="120.0" w:type="dxa"/>
+            </w:tcMar>
+            <w:vAlign w:val="top"/>
+          </w:tcPr>
+          <w:p>
+            <w:r>
+              <w:t xml:space="preserve">Mediación Cultural Impresa</w:t>
+            </w:r>
+          </w:p>
+        </w:tc>
+        <w:tc>
+          <w:tcPr>
+            <w:tcBorders>
+              <w:top w:color="dddddd" w:space="0" w:sz="6" w:val="single"/>
+              <w:left w:color="dddddd" w:space="0" w:sz="6" w:val="single"/>
+              <w:bottom w:color="dddddd" w:space="0" w:sz="6" w:val="single"/>
+              <w:right w:color="dddddd" w:space="0" w:sz="6" w:val="single"/>
+            </w:tcBorders>
+            <w:shd w:fill="auto" w:val="clear"/>
+            <w:tcMar>
+              <w:top w:w="120.0" w:type="dxa"/>
+              <w:left w:w="120.0" w:type="dxa"/>
+              <w:bottom w:w="120.0" w:type="dxa"/>
+              <w:right w:w="120.0" w:type="dxa"/>
+            </w:tcMar>
+            <w:vAlign w:val="top"/>
+          </w:tcPr>
+          <w:p>
+            <w:r>
+              <w:t xml:space="preserve">Folletos del proyecto (1,000 pzs.) en papel reciclado, tarjetas con código QR al repositorio público (500 pzs.), gafetes para el equipo, tarjetas explicativas en español e inglés y guía rápida del visitante.</w:t>
+            </w:r>
+          </w:p>
+        </w:tc>
+        <w:tc>
+          <w:tcPr>
+            <w:tcBorders>
+              <w:top w:color="dddddd" w:space="0" w:sz="6" w:val="single"/>
+              <w:left w:color="dddddd" w:space="0" w:sz="6" w:val="single"/>
+              <w:bottom w:color="dddddd" w:space="0" w:sz="6" w:val="single"/>
+              <w:right w:color="dddddd" w:space="0" w:sz="6" w:val="single"/>
+            </w:tcBorders>
+            <w:shd w:fill="auto" w:val="clear"/>
+            <w:tcMar>
+              <w:top w:w="120.0" w:type="dxa"/>
+              <w:left w:w="120.0" w:type="dxa"/>
+              <w:bottom w:w="120.0" w:type="dxa"/>
+              <w:right w:w="120.0" w:type="dxa"/>
+            </w:tcMar>
+            <w:vAlign w:val="top"/>
+          </w:tcPr>
+          <w:p>
+            <w:r>
+              <w:t xml:space="preserve">$1,400.00</w:t>
+            </w:r>
+          </w:p>
+        </w:tc>
+      </w:tr>
+      <w:tr>
+        <w:trPr>
+          <w:cantSplit w:val="0"/>
+          <w:tblHeader w:val="0"/>
+        </w:trPr>
+        <w:tc>
+          <w:tcPr>
+            <w:tcBorders>
+              <w:top w:color="dddddd" w:space="0" w:sz="6" w:val="single"/>
+              <w:left w:color="dddddd" w:space="0" w:sz="6" w:val="single"/>
+              <w:bottom w:color="dddddd" w:space="0" w:sz="6" w:val="single"/>
+              <w:right w:color="dddddd" w:space="0" w:sz="6" w:val="single"/>
+            </w:tcBorders>
+            <w:shd w:fill="auto" w:val="clear"/>
+            <w:tcMar>
+              <w:top w:w="120.0" w:type="dxa"/>
+              <w:left w:w="120.0" w:type="dxa"/>
+              <w:bottom w:w="120.0" w:type="dxa"/>
+              <w:right w:w="120.0" w:type="dxa"/>
+            </w:tcMar>
+            <w:vAlign w:val="top"/>
+          </w:tcPr>
+          <w:p>
+            <w:r>
+              <w:t xml:space="preserve">Material Fungible Operativo</w:t>
+            </w:r>
+          </w:p>
+        </w:tc>
+        <w:tc>
+          <w:tcPr>
+            <w:tcBorders>
+              <w:top w:color="dddddd" w:space="0" w:sz="6" w:val="single"/>
+              <w:left w:color="dddddd" w:space="0" w:sz="6" w:val="single"/>
+              <w:bottom w:color="dddddd" w:space="0" w:sz="6" w:val="single"/>
+              <w:right w:color="dddddd" w:space="0" w:sz="6" w:val="single"/>
+            </w:tcBorders>
+            <w:shd w:fill="auto" w:val="clear"/>
+            <w:tcMar>
+              <w:top w:w="120.0" w:type="dxa"/>
+              <w:left w:w="120.0" w:type="dxa"/>
+              <w:bottom w:w="120.0" w:type="dxa"/>
+              <w:right w:w="120.0" w:type="dxa"/>
+            </w:tcMar>
+            <w:vAlign w:val="top"/>
+          </w:tcPr>
+          <w:p>
+            <w:r>
+              <w:t xml:space="preserve">Pilas AA/AAA, microfibras, alcohol isopropílico, aire comprimido para limpieza de lentes, franelas, bolsas de resguardo y kit de primeros auxilios para la operación.</w:t>
+            </w:r>
+          </w:p>
+        </w:tc>
+        <w:tc>
+          <w:tcPr>
+            <w:tcBorders>
+              <w:top w:color="dddddd" w:space="0" w:sz="6" w:val="single"/>
+              <w:left w:color="dddddd" w:space="0" w:sz="6" w:val="single"/>
+              <w:bottom w:color="dddddd" w:space="0" w:sz="6" w:val="single"/>
+              <w:right w:color="dddddd" w:space="0" w:sz="6" w:val="single"/>
+            </w:tcBorders>
+            <w:shd w:fill="auto" w:val="clear"/>
+            <w:tcMar>
+              <w:top w:w="120.0" w:type="dxa"/>
+              <w:left w:w="120.0" w:type="dxa"/>
+              <w:bottom w:w="120.0" w:type="dxa"/>
+              <w:right w:w="120.0" w:type="dxa"/>
+            </w:tcMar>
+            <w:vAlign w:val="top"/>
+          </w:tcPr>
+          <w:p>
+            <w:r>
+              <w:t xml:space="preserve">$500.00</w:t>
+            </w:r>
+          </w:p>
+        </w:tc>
+      </w:tr>
+      <w:tr>
+        <w:trPr>
+          <w:cantSplit w:val="0"/>
+          <w:tblHeader w:val="0"/>
+        </w:trPr>
+        <w:tc>
+          <w:tcPr>
+            <w:tcBorders>
+              <w:top w:color="dddddd" w:space="0" w:sz="6" w:val="single"/>
+              <w:left w:color="dddddd" w:space="0" w:sz="6" w:val="single"/>
+              <w:bottom w:color="dddddd" w:space="0" w:sz="6" w:val="single"/>
+              <w:right w:color="dddddd" w:space="0" w:sz="6" w:val="single"/>
+            </w:tcBorders>
+            <w:shd w:fill="auto" w:val="clear"/>
+            <w:tcMar>
+              <w:top w:w="120.0" w:type="dxa"/>
+              <w:left w:w="120.0" w:type="dxa"/>
+              <w:bottom w:w="120.0" w:type="dxa"/>
+              <w:right w:w="120.0" w:type="dxa"/>
+            </w:tcMar>
+            <w:vAlign w:val="top"/>
+          </w:tcPr>
+          <w:p>
+            <w:r>
               <w:rPr>
-                <w:b w:val="1"/>
-                <w:bCs w:val="1"/>
-                <w:shd w:fill="auto" w:val="clear"/>
+                <w:b/>
               </w:rPr>
-            </w:pPr>
+              <w:t xml:space="preserve">Total (Gasto Corriente):</w:t>
+            </w:r>
+          </w:p>
+        </w:tc>
+        <w:tc>
+          <w:tcPr>
+            <w:tcBorders>
+              <w:top w:color="dddddd" w:space="0" w:sz="6" w:val="single"/>
+              <w:left w:color="dddddd" w:space="0" w:sz="6" w:val="single"/>
+              <w:bottom w:color="dddddd" w:space="0" w:sz="6" w:val="single"/>
+              <w:right w:color="dddddd" w:space="0" w:sz="6" w:val="single"/>
+            </w:tcBorders>
+            <w:shd w:fill="auto" w:val="clear"/>
+            <w:tcMar>
+              <w:top w:w="120.0" w:type="dxa"/>
+              <w:left w:w="120.0" w:type="dxa"/>
+              <w:bottom w:w="120.0" w:type="dxa"/>
+              <w:right w:w="120.0" w:type="dxa"/>
+            </w:tcMar>
+            <w:vAlign w:val="top"/>
+          </w:tcPr>
+          <w:p>
             <w:r>
               <w:rPr>
-                <w:b w:val="1"/>
-                <w:bCs w:val="1"/>
-                <w:shd w:fill="auto" w:val="clear"/>
-                <w:rtl w:val="0"/>
+                <w:b/>
               </w:rPr>
-              <w:t xml:space="preserve">Total Inversión:</w:t>
-            </w:r>
-          </w:p>
-        </w:tc>
-        <w:tc>
-          <w:tcPr>
-            <w:tcBorders>
-              <w:top w:color="dddddd" w:space="0" w:sz="6" w:val="single"/>
-              <w:left w:color="dddddd" w:space="0" w:sz="6" w:val="single"/>
-              <w:bottom w:color="dddddd" w:space="0" w:sz="6" w:val="single"/>
-              <w:right w:color="dddddd" w:space="0" w:sz="6" w:val="single"/>
-            </w:tcBorders>
-            <w:shd w:fill="f9f9f9" w:val="clear"/>
-            <w:tcMar>
-              <w:top w:w="120.0" w:type="dxa"/>
-              <w:left w:w="120.0" w:type="dxa"/>
-              <w:bottom w:w="120.0" w:type="dxa"/>
-              <w:right w:w="120.0" w:type="dxa"/>
-            </w:tcMar>
-            <w:vAlign w:val="top"/>
-          </w:tcPr>
-          <w:p>
-            <w:pPr>
-              <w:pBdr>
-                <w:top w:space="0" w:sz="0" w:val="nil"/>
-                <w:left w:space="0" w:sz="0" w:val="nil"/>
-                <w:bottom w:space="0" w:sz="0" w:val="nil"/>
-                <w:right w:space="0" w:sz="0" w:val="nil"/>
-                <w:between w:space="0" w:sz="0" w:val="nil"/>
-              </w:pBdr>
-              <w:shd w:fill="auto" w:val="clear"/>
-              <w:spacing w:after="120" w:before="120" w:line="300" w:lineRule="auto"/>
+              <w:t xml:space="preserve">Monto total de la solicitud</w:t>
+            </w:r>
+          </w:p>
+        </w:tc>
+        <w:tc>
+          <w:tcPr>
+            <w:tcBorders>
+              <w:top w:color="dddddd" w:space="0" w:sz="6" w:val="single"/>
+              <w:left w:color="dddddd" w:space="0" w:sz="6" w:val="single"/>
+              <w:bottom w:color="dddddd" w:space="0" w:sz="6" w:val="single"/>
+              <w:right w:color="dddddd" w:space="0" w:sz="6" w:val="single"/>
+            </w:tcBorders>
+            <w:shd w:fill="auto" w:val="clear"/>
+            <w:tcMar>
+              <w:top w:w="120.0" w:type="dxa"/>
+              <w:left w:w="120.0" w:type="dxa"/>
+              <w:bottom w:w="120.0" w:type="dxa"/>
+              <w:right w:w="120.0" w:type="dxa"/>
+            </w:tcMar>
+            <w:vAlign w:val="top"/>
+          </w:tcPr>
+          <w:p>
+            <w:r>
               <w:rPr>
-                <w:b w:val="1"/>
-                <w:bCs w:val="1"/>
-                <w:shd w:fill="auto" w:val="clear"/>
-              </w:rPr>
-            </w:pPr>
-            <w:r>
-              <w:rPr>
-                <w:b w:val="1"/>
-                <w:bCs w:val="1"/>
-                <w:shd w:fill="auto" w:val="clear"/>
-                <w:rtl w:val="0"/>
+                <w:b/>
               </w:rPr>
               <w:t xml:space="preserve">$20,000.00</w:t>
             </w:r>

</xml_diff>